<commit_message>
docs: stop printing passwords, point at the gitignored credentials file
The walkthrough and test plan were written with the demo passwords inline, and
both are committed - so they reproduced exactly the problem that got
demo_credentials.txt untracked one commit earlier. The passwords themselves
have since been rotated, but the documents should not have carried them in the
first place.

They now name the accounts and say where to read the passwords from:
demo_credentials.txt at the project root, which is gitignored and holds the
PayMongo test cards too. The docx cover page is regenerated the same way.
</commit_message>
<xml_diff>
--- a/walkthrough.docx
+++ b/walkthrough.docx
@@ -89,7 +89,918 @@
           <w:color w:val="55605A"/>
           <w:sz w:val="20"/>
         </w:rPr>
-        <w:t>All four verified working — each signs in through the real login form and reaches its dashboard. The password is the same for every account.</w:t>
+        <w:t>All four accounts are live and verified. Passwords are not printed here — read them from demo_credentials.txt at the project root, which is gitignored.</w:t>
+      </w:r>
+    </w:p>
+    <w:tbl>
+      <w:tblPr>
+        <w:tblStyle w:val="TableGrid"/>
+        <w:tblW w:type="auto" w:w="0"/>
+        <w:jc w:val="center"/>
+        <w:tblLook w:firstColumn="1" w:firstRow="1" w:lastColumn="0" w:lastRow="0" w:noHBand="0" w:noVBand="1" w:val="04A0"/>
+      </w:tblPr>
+      <w:tblGrid>
+        <w:gridCol w:w="3216"/>
+        <w:gridCol w:w="3216"/>
+        <w:gridCol w:w="3216"/>
+      </w:tblGrid>
+      <w:tr>
+        <w:tc>
+          <w:tcPr>
+            <w:tcW w:type="dxa" w:w="3216"/>
+            <w:shd w:val="clear" w:fill="0B5E33"/>
+          </w:tcPr>
+          <w:p>
+            <w:r>
+              <w:rPr>
+                <w:b/>
+                <w:color w:val="FFFFFF"/>
+                <w:sz w:val="19"/>
+              </w:rPr>
+            </w:r>
+            <w:r>
+              <w:rPr>
+                <w:b/>
+                <w:i w:val="0"/>
+                <w:color w:val="FFFFFF"/>
+                <w:sz w:val="19"/>
+              </w:rPr>
+              <w:t>Role</w:t>
+            </w:r>
+          </w:p>
+        </w:tc>
+        <w:tc>
+          <w:tcPr>
+            <w:tcW w:type="dxa" w:w="3216"/>
+            <w:shd w:val="clear" w:fill="0B5E33"/>
+          </w:tcPr>
+          <w:p>
+            <w:r>
+              <w:rPr>
+                <w:b/>
+                <w:color w:val="FFFFFF"/>
+                <w:sz w:val="19"/>
+              </w:rPr>
+            </w:r>
+            <w:r>
+              <w:rPr>
+                <w:b/>
+                <w:i w:val="0"/>
+                <w:color w:val="FFFFFF"/>
+                <w:sz w:val="19"/>
+              </w:rPr>
+              <w:t>Email</w:t>
+            </w:r>
+          </w:p>
+        </w:tc>
+        <w:tc>
+          <w:tcPr>
+            <w:tcW w:type="dxa" w:w="3216"/>
+            <w:shd w:val="clear" w:fill="0B5E33"/>
+          </w:tcPr>
+          <w:p>
+            <w:r>
+              <w:rPr>
+                <w:b/>
+                <w:color w:val="FFFFFF"/>
+                <w:sz w:val="19"/>
+              </w:rPr>
+            </w:r>
+            <w:r>
+              <w:rPr>
+                <w:b/>
+                <w:i w:val="0"/>
+                <w:color w:val="FFFFFF"/>
+                <w:sz w:val="19"/>
+              </w:rPr>
+              <w:t>Lands on</w:t>
+            </w:r>
+          </w:p>
+        </w:tc>
+      </w:tr>
+      <w:tr>
+        <w:tc>
+          <w:tcPr>
+            <w:tcW w:type="dxa" w:w="3216"/>
+          </w:tcPr>
+          <w:p>
+            <w:r>
+              <w:rPr>
+                <w:sz w:val="19"/>
+              </w:rPr>
+            </w:r>
+            <w:r>
+              <w:rPr>
+                <w:b/>
+                <w:i w:val="0"/>
+                <w:sz w:val="19"/>
+              </w:rPr>
+              <w:t>Admin</w:t>
+            </w:r>
+          </w:p>
+        </w:tc>
+        <w:tc>
+          <w:tcPr>
+            <w:tcW w:type="dxa" w:w="3216"/>
+          </w:tcPr>
+          <w:p>
+            <w:r>
+              <w:rPr>
+                <w:sz w:val="19"/>
+              </w:rPr>
+            </w:r>
+            <w:r>
+              <w:rPr>
+                <w:rFonts w:ascii="Consolas" w:hAnsi="Consolas"/>
+                <w:b w:val="0"/>
+                <w:i w:val="0"/>
+                <w:color w:val="0B5E33"/>
+                <w:sz w:val="19"/>
+              </w:rPr>
+              <w:t>admin@ewize.com</w:t>
+            </w:r>
+          </w:p>
+        </w:tc>
+        <w:tc>
+          <w:tcPr>
+            <w:tcW w:type="dxa" w:w="3216"/>
+          </w:tcPr>
+          <w:p>
+            <w:r>
+              <w:rPr>
+                <w:sz w:val="19"/>
+              </w:rPr>
+            </w:r>
+            <w:r>
+              <w:rPr>
+                <w:rFonts w:ascii="Consolas" w:hAnsi="Consolas"/>
+                <w:b w:val="0"/>
+                <w:i w:val="0"/>
+                <w:color w:val="0B5E33"/>
+                <w:sz w:val="19"/>
+              </w:rPr>
+              <w:t>/admin</w:t>
+            </w:r>
+          </w:p>
+        </w:tc>
+      </w:tr>
+      <w:tr>
+        <w:tc>
+          <w:tcPr>
+            <w:tcW w:type="dxa" w:w="3216"/>
+          </w:tcPr>
+          <w:p>
+            <w:r>
+              <w:rPr>
+                <w:sz w:val="19"/>
+              </w:rPr>
+            </w:r>
+            <w:r>
+              <w:rPr>
+                <w:b/>
+                <w:i w:val="0"/>
+                <w:sz w:val="19"/>
+              </w:rPr>
+              <w:t>Trainer</w:t>
+            </w:r>
+            <w:r>
+              <w:rPr>
+                <w:b w:val="0"/>
+                <w:i w:val="0"/>
+                <w:sz w:val="19"/>
+              </w:rPr>
+              <w:t xml:space="preserve"> (employee)</w:t>
+            </w:r>
+          </w:p>
+        </w:tc>
+        <w:tc>
+          <w:tcPr>
+            <w:tcW w:type="dxa" w:w="3216"/>
+          </w:tcPr>
+          <w:p>
+            <w:r>
+              <w:rPr>
+                <w:sz w:val="19"/>
+              </w:rPr>
+            </w:r>
+            <w:r>
+              <w:rPr>
+                <w:rFonts w:ascii="Consolas" w:hAnsi="Consolas"/>
+                <w:b w:val="0"/>
+                <w:i w:val="0"/>
+                <w:color w:val="0B5E33"/>
+                <w:sz w:val="19"/>
+              </w:rPr>
+              <w:t>patricia.v@ewize.com</w:t>
+            </w:r>
+          </w:p>
+        </w:tc>
+        <w:tc>
+          <w:tcPr>
+            <w:tcW w:type="dxa" w:w="3216"/>
+          </w:tcPr>
+          <w:p>
+            <w:r>
+              <w:rPr>
+                <w:sz w:val="19"/>
+              </w:rPr>
+            </w:r>
+            <w:r>
+              <w:rPr>
+                <w:rFonts w:ascii="Consolas" w:hAnsi="Consolas"/>
+                <w:b w:val="0"/>
+                <w:i w:val="0"/>
+                <w:color w:val="0B5E33"/>
+                <w:sz w:val="19"/>
+              </w:rPr>
+              <w:t>/employee</w:t>
+            </w:r>
+          </w:p>
+        </w:tc>
+      </w:tr>
+      <w:tr>
+        <w:tc>
+          <w:tcPr>
+            <w:tcW w:type="dxa" w:w="3216"/>
+          </w:tcPr>
+          <w:p>
+            <w:r>
+              <w:rPr>
+                <w:sz w:val="19"/>
+              </w:rPr>
+            </w:r>
+            <w:r>
+              <w:rPr>
+                <w:b/>
+                <w:i w:val="0"/>
+                <w:sz w:val="19"/>
+              </w:rPr>
+              <w:t>Trainee</w:t>
+            </w:r>
+            <w:r>
+              <w:rPr>
+                <w:b w:val="0"/>
+                <w:i w:val="0"/>
+                <w:sz w:val="19"/>
+              </w:rPr>
+              <w:t xml:space="preserve"> — finished, holds NFT #2</w:t>
+            </w:r>
+          </w:p>
+        </w:tc>
+        <w:tc>
+          <w:tcPr>
+            <w:tcW w:type="dxa" w:w="3216"/>
+          </w:tcPr>
+          <w:p>
+            <w:r>
+              <w:rPr>
+                <w:sz w:val="19"/>
+              </w:rPr>
+            </w:r>
+            <w:r>
+              <w:rPr>
+                <w:rFonts w:ascii="Consolas" w:hAnsi="Consolas"/>
+                <w:b w:val="0"/>
+                <w:i w:val="0"/>
+                <w:color w:val="0B5E33"/>
+                <w:sz w:val="19"/>
+              </w:rPr>
+              <w:t>miguel.torres@gmail.com</w:t>
+            </w:r>
+          </w:p>
+        </w:tc>
+        <w:tc>
+          <w:tcPr>
+            <w:tcW w:type="dxa" w:w="3216"/>
+          </w:tcPr>
+          <w:p>
+            <w:r>
+              <w:rPr>
+                <w:sz w:val="19"/>
+              </w:rPr>
+            </w:r>
+            <w:r>
+              <w:rPr>
+                <w:rFonts w:ascii="Consolas" w:hAnsi="Consolas"/>
+                <w:b w:val="0"/>
+                <w:i w:val="0"/>
+                <w:color w:val="0B5E33"/>
+                <w:sz w:val="19"/>
+              </w:rPr>
+              <w:t>/portal</w:t>
+            </w:r>
+          </w:p>
+        </w:tc>
+      </w:tr>
+      <w:tr>
+        <w:tc>
+          <w:tcPr>
+            <w:tcW w:type="dxa" w:w="3216"/>
+          </w:tcPr>
+          <w:p>
+            <w:r>
+              <w:rPr>
+                <w:sz w:val="19"/>
+              </w:rPr>
+            </w:r>
+            <w:r>
+              <w:rPr>
+                <w:b/>
+                <w:i w:val="0"/>
+                <w:sz w:val="19"/>
+              </w:rPr>
+              <w:t>Trainee</w:t>
+            </w:r>
+            <w:r>
+              <w:rPr>
+                <w:b w:val="0"/>
+                <w:i w:val="0"/>
+                <w:sz w:val="19"/>
+              </w:rPr>
+              <w:t xml:space="preserve"> — fresh, 0% progress</w:t>
+            </w:r>
+          </w:p>
+        </w:tc>
+        <w:tc>
+          <w:tcPr>
+            <w:tcW w:type="dxa" w:w="3216"/>
+          </w:tcPr>
+          <w:p>
+            <w:r>
+              <w:rPr>
+                <w:sz w:val="19"/>
+              </w:rPr>
+            </w:r>
+            <w:r>
+              <w:rPr>
+                <w:rFonts w:ascii="Consolas" w:hAnsi="Consolas"/>
+                <w:b w:val="0"/>
+                <w:i w:val="0"/>
+                <w:color w:val="0B5E33"/>
+                <w:sz w:val="19"/>
+              </w:rPr>
+              <w:t>yivoveh244@bitmah.com</w:t>
+            </w:r>
+          </w:p>
+        </w:tc>
+        <w:tc>
+          <w:tcPr>
+            <w:tcW w:type="dxa" w:w="3216"/>
+          </w:tcPr>
+          <w:p>
+            <w:r>
+              <w:rPr>
+                <w:sz w:val="19"/>
+              </w:rPr>
+            </w:r>
+            <w:r>
+              <w:rPr>
+                <w:rFonts w:ascii="Consolas" w:hAnsi="Consolas"/>
+                <w:b w:val="0"/>
+                <w:i w:val="0"/>
+                <w:color w:val="0B5E33"/>
+                <w:sz w:val="19"/>
+              </w:rPr>
+              <w:t>/portal</w:t>
+            </w:r>
+          </w:p>
+        </w:tc>
+      </w:tr>
+    </w:tbl>
+    <w:p>
+      <w:pPr>
+        <w:spacing w:after="40"/>
+      </w:pPr>
+    </w:p>
+    <w:p>
+      <w:r>
+        <w:br w:type="page"/>
+      </w:r>
+    </w:p>
+    <w:p>
+      <w:pPr>
+        <w:pStyle w:val="Heading1"/>
+      </w:pPr>
+      <w:r>
+        <w:rPr>
+          <w:b w:val="0"/>
+          <w:i w:val="0"/>
+          <w:color w:val="0B5E33"/>
+        </w:rPr>
+        <w:t>PowerWize — Hands-on Walkthrough</w:t>
+      </w:r>
+    </w:p>
+    <w:p>
+      <w:r>
+        <w:rPr>
+          <w:b w:val="0"/>
+          <w:i w:val="0"/>
+        </w:rPr>
+        <w:t xml:space="preserve">One continuous session where you follow a single person from </w:t>
+      </w:r>
+      <w:r>
+        <w:rPr>
+          <w:b w:val="0"/>
+          <w:i/>
+        </w:rPr>
+        <w:t>never heard of EnergyWize</w:t>
+      </w:r>
+      <w:r>
+        <w:rPr>
+          <w:b w:val="0"/>
+          <w:i w:val="0"/>
+        </w:rPr>
+        <w:t xml:space="preserve"> to </w:t>
+      </w:r>
+      <w:r>
+        <w:rPr>
+          <w:b w:val="0"/>
+          <w:i/>
+        </w:rPr>
+        <w:t>certified, with a solar quotation</w:t>
+      </w:r>
+      <w:r>
+        <w:rPr>
+          <w:b w:val="0"/>
+          <w:i w:val="0"/>
+        </w:rPr>
+        <w:t>. Every role and nearly every screen gets touched, in the order a real user would hit them, so each step sets up the next.</w:t>
+      </w:r>
+    </w:p>
+    <w:p>
+      <w:r>
+        <w:rPr>
+          <w:b/>
+          <w:i w:val="0"/>
+        </w:rPr>
+        <w:t>Time:</w:t>
+      </w:r>
+      <w:r>
+        <w:rPr>
+          <w:b w:val="0"/>
+          <w:i w:val="0"/>
+        </w:rPr>
+        <w:t xml:space="preserve"> ~90 minutes end to end. Each act stands alone if you want to skip around, except Acts 2–5, which are one chain.</w:t>
+      </w:r>
+    </w:p>
+    <w:p>
+      <w:pPr>
+        <w:pStyle w:val="Heading2"/>
+      </w:pPr>
+      <w:r>
+        <w:rPr>
+          <w:b w:val="0"/>
+          <w:i w:val="0"/>
+          <w:color w:val="0A1710"/>
+        </w:rPr>
+        <w:t>Prep — 5 minutes</w:t>
+      </w:r>
+    </w:p>
+    <w:p>
+      <w:pPr>
+        <w:pStyle w:val="Heading3"/>
+      </w:pPr>
+      <w:r>
+        <w:rPr>
+          <w:b w:val="0"/>
+          <w:i w:val="0"/>
+          <w:color w:val="0A1710"/>
+        </w:rPr>
+        <w:t>1. Fix the database connection</w:t>
+      </w:r>
+    </w:p>
+    <w:p>
+      <w:r>
+        <w:rPr>
+          <w:rFonts w:ascii="Consolas" w:hAnsi="Consolas"/>
+          <w:b w:val="0"/>
+          <w:i w:val="0"/>
+          <w:color w:val="0B5E33"/>
+          <w:sz w:val="19"/>
+        </w:rPr>
+        <w:t>.env</w:t>
+      </w:r>
+      <w:r>
+        <w:rPr>
+          <w:b w:val="0"/>
+          <w:i w:val="0"/>
+        </w:rPr>
+        <w:t xml:space="preserve"> points </w:t>
+      </w:r>
+      <w:r>
+        <w:rPr>
+          <w:rFonts w:ascii="Consolas" w:hAnsi="Consolas"/>
+          <w:b w:val="0"/>
+          <w:i w:val="0"/>
+          <w:color w:val="0B5E33"/>
+          <w:sz w:val="19"/>
+        </w:rPr>
+        <w:t>DATABASE_URL</w:t>
+      </w:r>
+      <w:r>
+        <w:rPr>
+          <w:b w:val="0"/>
+          <w:i w:val="0"/>
+        </w:rPr>
+        <w:t xml:space="preserve"> at a Postgres role named </w:t>
+      </w:r>
+      <w:r>
+        <w:rPr>
+          <w:rFonts w:ascii="Consolas" w:hAnsi="Consolas"/>
+          <w:b w:val="0"/>
+          <w:i w:val="0"/>
+          <w:color w:val="0B5E33"/>
+          <w:sz w:val="19"/>
+        </w:rPr>
+        <w:t>McZeal</w:t>
+      </w:r>
+      <w:r>
+        <w:rPr>
+          <w:b w:val="0"/>
+          <w:i w:val="0"/>
+        </w:rPr>
+        <w:t xml:space="preserve"> that doesn't exist in your Laragon cluster. Change the user to </w:t>
+      </w:r>
+      <w:r>
+        <w:rPr>
+          <w:rFonts w:ascii="Consolas" w:hAnsi="Consolas"/>
+          <w:b w:val="0"/>
+          <w:i w:val="0"/>
+          <w:color w:val="0B5E33"/>
+          <w:sz w:val="19"/>
+        </w:rPr>
+        <w:t>postgres</w:t>
+      </w:r>
+      <w:r>
+        <w:rPr>
+          <w:b w:val="0"/>
+          <w:i w:val="0"/>
+        </w:rPr>
+        <w:t>:</w:t>
+      </w:r>
+    </w:p>
+    <w:tbl>
+      <w:tblPr>
+        <w:tblStyle w:val="TableGrid"/>
+        <w:tblW w:type="auto" w:w="0"/>
+        <w:tblLook w:firstColumn="1" w:firstRow="1" w:lastColumn="0" w:lastRow="0" w:noHBand="0" w:noVBand="1" w:val="04A0"/>
+      </w:tblPr>
+      <w:tblGrid>
+        <w:gridCol w:w="9648"/>
+      </w:tblGrid>
+      <w:tr>
+        <w:tc>
+          <w:tcPr>
+            <w:tcW w:type="dxa" w:w="9648"/>
+            <w:shd w:val="clear" w:fill="F2F4F3"/>
+          </w:tcPr>
+          <w:p>
+            <w:pPr>
+              <w:spacing w:after="0" w:line="240" w:lineRule="auto"/>
+            </w:pPr>
+            <w:r/>
+            <w:r>
+              <w:rPr>
+                <w:rFonts w:ascii="Consolas" w:hAnsi="Consolas"/>
+                <w:sz w:val="18"/>
+              </w:rPr>
+              <w:t>DATABASE_URL=postgresql://postgres@localhost:5432/powerwize</w:t>
+            </w:r>
+          </w:p>
+        </w:tc>
+      </w:tr>
+    </w:tbl>
+    <w:p>
+      <w:pPr>
+        <w:spacing w:after="40"/>
+      </w:pPr>
+    </w:p>
+    <w:p>
+      <w:pPr>
+        <w:pStyle w:val="Heading3"/>
+      </w:pPr>
+      <w:r>
+        <w:rPr>
+          <w:b w:val="0"/>
+          <w:i w:val="0"/>
+          <w:color w:val="0A1710"/>
+        </w:rPr>
+        <w:t>2. Start Postgres</w:t>
+      </w:r>
+    </w:p>
+    <w:tbl>
+      <w:tblPr>
+        <w:tblStyle w:val="TableGrid"/>
+        <w:tblW w:type="auto" w:w="0"/>
+        <w:tblLook w:firstColumn="1" w:firstRow="1" w:lastColumn="0" w:lastRow="0" w:noHBand="0" w:noVBand="1" w:val="04A0"/>
+      </w:tblPr>
+      <w:tblGrid>
+        <w:gridCol w:w="9648"/>
+      </w:tblGrid>
+      <w:tr>
+        <w:tc>
+          <w:tcPr>
+            <w:tcW w:type="dxa" w:w="9648"/>
+            <w:shd w:val="clear" w:fill="F2F4F3"/>
+          </w:tcPr>
+          <w:p>
+            <w:pPr>
+              <w:spacing w:after="0" w:line="240" w:lineRule="auto"/>
+            </w:pPr>
+            <w:r/>
+            <w:r>
+              <w:rPr>
+                <w:rFonts w:ascii="Consolas" w:hAnsi="Consolas"/>
+                <w:sz w:val="18"/>
+              </w:rPr>
+              <w:t>"C:\laragon\bin\postgresql\postgresql-18.4-1-windows-x64\bin\pg_ctl.exe" \</w:t>
+            </w:r>
+          </w:p>
+          <w:p>
+            <w:pPr>
+              <w:spacing w:after="0" w:line="240" w:lineRule="auto"/>
+            </w:pPr>
+            <w:r>
+              <w:rPr>
+                <w:rFonts w:ascii="Consolas" w:hAnsi="Consolas"/>
+                <w:sz w:val="18"/>
+              </w:rPr>
+              <w:t xml:space="preserve">  -D "C:\laragon\data\postgresql" start</w:t>
+            </w:r>
+          </w:p>
+        </w:tc>
+      </w:tr>
+    </w:tbl>
+    <w:p>
+      <w:pPr>
+        <w:spacing w:after="40"/>
+      </w:pPr>
+    </w:p>
+    <w:p>
+      <w:pPr>
+        <w:pStyle w:val="Heading3"/>
+      </w:pPr>
+      <w:r>
+        <w:rPr>
+          <w:b w:val="0"/>
+          <w:i w:val="0"/>
+          <w:color w:val="0A1710"/>
+        </w:rPr>
+        <w:t>3. Decide about AI</w:t>
+      </w:r>
+    </w:p>
+    <w:p>
+      <w:r>
+        <w:rPr>
+          <w:rFonts w:ascii="Consolas" w:hAnsi="Consolas"/>
+          <w:b w:val="0"/>
+          <w:i w:val="0"/>
+          <w:color w:val="0B5E33"/>
+          <w:sz w:val="19"/>
+        </w:rPr>
+        <w:t>.env</w:t>
+      </w:r>
+      <w:r>
+        <w:rPr>
+          <w:b w:val="0"/>
+          <w:i w:val="0"/>
+        </w:rPr>
+        <w:t xml:space="preserve"> currently routes all AI at LM Studio on </w:t>
+      </w:r>
+      <w:r>
+        <w:rPr>
+          <w:rFonts w:ascii="Consolas" w:hAnsi="Consolas"/>
+          <w:b w:val="0"/>
+          <w:i w:val="0"/>
+          <w:color w:val="0B5E33"/>
+          <w:sz w:val="19"/>
+        </w:rPr>
+        <w:t>localhost:1234</w:t>
+      </w:r>
+      <w:r>
+        <w:rPr>
+          <w:b w:val="0"/>
+          <w:i w:val="0"/>
+        </w:rPr>
+        <w:t xml:space="preserve">. Either start LM Studio with </w:t>
+      </w:r>
+      <w:r>
+        <w:rPr>
+          <w:rFonts w:ascii="Consolas" w:hAnsi="Consolas"/>
+          <w:b w:val="0"/>
+          <w:i w:val="0"/>
+          <w:color w:val="0B5E33"/>
+          <w:sz w:val="19"/>
+        </w:rPr>
+        <w:t>qwen/qwen3-vl-8b</w:t>
+      </w:r>
+      <w:r>
+        <w:rPr>
+          <w:b w:val="0"/>
+          <w:i w:val="0"/>
+        </w:rPr>
+        <w:t xml:space="preserve">, </w:t>
+      </w:r>
+      <w:r>
+        <w:rPr>
+          <w:b/>
+          <w:i w:val="0"/>
+        </w:rPr>
+        <w:t>or</w:t>
+      </w:r>
+      <w:r>
+        <w:rPr>
+          <w:b w:val="0"/>
+          <w:i w:val="0"/>
+        </w:rPr>
+        <w:t xml:space="preserve"> switch to Groq (your key is already set):</w:t>
+      </w:r>
+    </w:p>
+    <w:tbl>
+      <w:tblPr>
+        <w:tblStyle w:val="TableGrid"/>
+        <w:tblW w:type="auto" w:w="0"/>
+        <w:tblLook w:firstColumn="1" w:firstRow="1" w:lastColumn="0" w:lastRow="0" w:noHBand="0" w:noVBand="1" w:val="04A0"/>
+      </w:tblPr>
+      <w:tblGrid>
+        <w:gridCol w:w="9648"/>
+      </w:tblGrid>
+      <w:tr>
+        <w:tc>
+          <w:tcPr>
+            <w:tcW w:type="dxa" w:w="9648"/>
+            <w:shd w:val="clear" w:fill="F2F4F3"/>
+          </w:tcPr>
+          <w:p>
+            <w:pPr>
+              <w:spacing w:after="0" w:line="240" w:lineRule="auto"/>
+            </w:pPr>
+            <w:r/>
+            <w:r>
+              <w:rPr>
+                <w:rFonts w:ascii="Consolas" w:hAnsi="Consolas"/>
+                <w:sz w:val="18"/>
+              </w:rPr>
+              <w:t>AI_PROVIDER=groq</w:t>
+            </w:r>
+          </w:p>
+          <w:p>
+            <w:pPr>
+              <w:spacing w:after="0" w:line="240" w:lineRule="auto"/>
+            </w:pPr>
+            <w:r>
+              <w:rPr>
+                <w:rFonts w:ascii="Consolas" w:hAnsi="Consolas"/>
+                <w:sz w:val="18"/>
+              </w:rPr>
+              <w:t>TEXT_PROVIDER=groq</w:t>
+            </w:r>
+          </w:p>
+          <w:p>
+            <w:pPr>
+              <w:spacing w:after="0" w:line="240" w:lineRule="auto"/>
+            </w:pPr>
+            <w:r>
+              <w:rPr>
+                <w:rFonts w:ascii="Consolas" w:hAnsi="Consolas"/>
+                <w:sz w:val="18"/>
+              </w:rPr>
+              <w:t>VISION_PROVIDER=groq</w:t>
+            </w:r>
+          </w:p>
+        </w:tc>
+      </w:tr>
+    </w:tbl>
+    <w:p>
+      <w:pPr>
+        <w:spacing w:after="40"/>
+      </w:pPr>
+    </w:p>
+    <w:p>
+      <w:r>
+        <w:rPr>
+          <w:b w:val="0"/>
+          <w:i w:val="0"/>
+        </w:rPr>
+        <w:t>Affects: upload validation, face match, quiz generation, quiz hints, module chat, bill OCR, Solara. Everything else works without it.</w:t>
+      </w:r>
+    </w:p>
+    <w:p>
+      <w:pPr>
+        <w:pStyle w:val="Heading3"/>
+      </w:pPr>
+      <w:r>
+        <w:rPr>
+          <w:b w:val="0"/>
+          <w:i w:val="0"/>
+          <w:color w:val="0A1710"/>
+        </w:rPr>
+        <w:t>4. Test accounts — already set up</w:t>
+      </w:r>
+    </w:p>
+    <w:p>
+      <w:r>
+        <w:rPr>
+          <w:b w:val="0"/>
+          <w:i w:val="0"/>
+        </w:rPr>
+        <w:t>Four accounts are live and verified: each logs in through the real form and reaches its dashboard.</w:t>
+      </w:r>
+    </w:p>
+    <w:p>
+      <w:pPr>
+        <w:ind w:left="432"/>
+      </w:pPr>
+      <w:r>
+        <w:rPr>
+          <w:b/>
+          <w:i/>
+          <w:color w:val="55605A"/>
+        </w:rPr>
+        <w:t>Passwords are deliberately not written here.</w:t>
+      </w:r>
+      <w:r>
+        <w:rPr>
+          <w:b w:val="0"/>
+          <w:i/>
+          <w:color w:val="55605A"/>
+        </w:rPr>
+        <w:t xml:space="preserve"> This file is committed to the</w:t>
+      </w:r>
+    </w:p>
+    <w:p>
+      <w:pPr>
+        <w:ind w:left="432"/>
+      </w:pPr>
+      <w:r>
+        <w:rPr>
+          <w:b w:val="0"/>
+          <w:i/>
+          <w:color w:val="55605A"/>
+        </w:rPr>
+        <w:t xml:space="preserve">repository, and an earlier version of </w:t>
+      </w:r>
+      <w:r>
+        <w:rPr>
+          <w:rFonts w:ascii="Consolas" w:hAnsi="Consolas"/>
+          <w:b w:val="0"/>
+          <w:i/>
+          <w:color w:val="55605A"/>
+          <w:sz w:val="19"/>
+        </w:rPr>
+        <w:t>demo_credentials.txt</w:t>
+      </w:r>
+      <w:r>
+        <w:rPr>
+          <w:b w:val="0"/>
+          <w:i/>
+          <w:color w:val="55605A"/>
+        </w:rPr>
+        <w:t xml:space="preserve"> put working passwords into</w:t>
+      </w:r>
+    </w:p>
+    <w:p>
+      <w:pPr>
+        <w:ind w:left="432"/>
+      </w:pPr>
+      <w:r>
+        <w:rPr>
+          <w:b w:val="0"/>
+          <w:i/>
+          <w:color w:val="55605A"/>
+        </w:rPr>
+        <w:t xml:space="preserve">git history. Read them from </w:t>
+      </w:r>
+      <w:r>
+        <w:rPr>
+          <w:rFonts w:ascii="Consolas" w:hAnsi="Consolas"/>
+          <w:b/>
+          <w:i/>
+          <w:color w:val="55605A"/>
+          <w:sz w:val="19"/>
+        </w:rPr>
+        <w:t>demo_credentials.txt</w:t>
+      </w:r>
+      <w:r>
+        <w:rPr>
+          <w:b w:val="0"/>
+          <w:i/>
+          <w:color w:val="55605A"/>
+        </w:rPr>
+        <w:t xml:space="preserve"> at the project root, which is</w:t>
+      </w:r>
+    </w:p>
+    <w:p>
+      <w:pPr>
+        <w:ind w:left="432"/>
+      </w:pPr>
+      <w:r>
+        <w:rPr>
+          <w:b w:val="0"/>
+          <w:i/>
+          <w:color w:val="55605A"/>
+        </w:rPr>
+        <w:t>gitignored. It also carries the PayMongo test card numbers used in Act 5.</w:t>
       </w:r>
     </w:p>
     <w:tbl>
@@ -174,7 +1085,7 @@
                 <w:color w:val="FFFFFF"/>
                 <w:sz w:val="19"/>
               </w:rPr>
-              <w:t>Password</w:t>
+              <w:t>Lands on</w:t>
             </w:r>
           </w:p>
         </w:tc>
@@ -198,7 +1109,7 @@
                 <w:color w:val="FFFFFF"/>
                 <w:sz w:val="19"/>
               </w:rPr>
-              <w:t>Lands on</w:t>
+              <w:t>Why this one</w:t>
             </w:r>
           </w:p>
         </w:tc>
@@ -264,7 +1175,7 @@
                 <w:color w:val="0B5E33"/>
                 <w:sz w:val="19"/>
               </w:rPr>
-              <w:t>Test@1234</w:t>
+              <w:t>/admin</w:t>
             </w:r>
           </w:p>
         </w:tc>
@@ -280,13 +1191,11 @@
             </w:r>
             <w:r>
               <w:rPr>
-                <w:rFonts w:ascii="Consolas" w:hAnsi="Consolas"/>
                 <w:b w:val="0"/>
                 <w:i w:val="0"/>
-                <w:color w:val="0B5E33"/>
                 <w:sz w:val="19"/>
               </w:rPr>
-              <w:t>/admin</w:t>
+              <w:t>Full oversight</w:t>
             </w:r>
           </w:p>
         </w:tc>
@@ -309,14 +1218,6 @@
                 <w:sz w:val="19"/>
               </w:rPr>
               <w:t>Trainer</w:t>
-            </w:r>
-            <w:r>
-              <w:rPr>
-                <w:b w:val="0"/>
-                <w:i w:val="0"/>
-                <w:sz w:val="19"/>
-              </w:rPr>
-              <w:t xml:space="preserve"> (employee)</w:t>
             </w:r>
           </w:p>
         </w:tc>
@@ -360,7 +1261,7 @@
                 <w:color w:val="0B5E33"/>
                 <w:sz w:val="19"/>
               </w:rPr>
-              <w:t>Test@1234</w:t>
+              <w:t>/employee</w:t>
             </w:r>
           </w:p>
         </w:tc>
@@ -376,13 +1277,11 @@
             </w:r>
             <w:r>
               <w:rPr>
-                <w:rFonts w:ascii="Consolas" w:hAnsi="Consolas"/>
                 <w:b w:val="0"/>
                 <w:i w:val="0"/>
-                <w:color w:val="0B5E33"/>
                 <w:sz w:val="19"/>
               </w:rPr>
-              <w:t>/employee</w:t>
+              <w:t>Owns modules and submissions</w:t>
             </w:r>
           </w:p>
         </w:tc>
@@ -405,14 +1304,6 @@
                 <w:sz w:val="19"/>
               </w:rPr>
               <w:t>Trainee</w:t>
-            </w:r>
-            <w:r>
-              <w:rPr>
-                <w:b w:val="0"/>
-                <w:i w:val="0"/>
-                <w:sz w:val="19"/>
-              </w:rPr>
-              <w:t xml:space="preserve"> — finished, certified</w:t>
             </w:r>
           </w:p>
         </w:tc>
@@ -456,7 +1347,7 @@
                 <w:color w:val="0B5E33"/>
                 <w:sz w:val="19"/>
               </w:rPr>
-              <w:t>Test@1234</w:t>
+              <w:t>/portal</w:t>
             </w:r>
           </w:p>
         </w:tc>
@@ -472,13 +1363,11 @@
             </w:r>
             <w:r>
               <w:rPr>
-                <w:rFonts w:ascii="Consolas" w:hAnsi="Consolas"/>
                 <w:b w:val="0"/>
                 <w:i w:val="0"/>
-                <w:color w:val="0B5E33"/>
                 <w:sz w:val="19"/>
               </w:rPr>
-              <w:t>/portal</w:t>
+              <w:t>Paid, 100% done, holds certificate NFT #2 — best case</w:t>
             </w:r>
           </w:p>
         </w:tc>
@@ -501,14 +1390,6 @@
                 <w:sz w:val="19"/>
               </w:rPr>
               <w:t>Trainee</w:t>
-            </w:r>
-            <w:r>
-              <w:rPr>
-                <w:b w:val="0"/>
-                <w:i w:val="0"/>
-                <w:sz w:val="19"/>
-              </w:rPr>
-              <w:t xml:space="preserve"> — fresh, 0% progress</w:t>
             </w:r>
           </w:p>
         </w:tc>
@@ -552,1048 +1433,13 @@
                 <w:color w:val="0B5E33"/>
                 <w:sz w:val="19"/>
               </w:rPr>
-              <w:t>Test@1234</w:t>
+              <w:t>/portal</w:t>
             </w:r>
           </w:p>
         </w:tc>
         <w:tc>
           <w:tcPr>
             <w:tcW w:type="dxa" w:w="2412"/>
-          </w:tcPr>
-          <w:p>
-            <w:r>
-              <w:rPr>
-                <w:sz w:val="19"/>
-              </w:rPr>
-            </w:r>
-            <w:r>
-              <w:rPr>
-                <w:rFonts w:ascii="Consolas" w:hAnsi="Consolas"/>
-                <w:b w:val="0"/>
-                <w:i w:val="0"/>
-                <w:color w:val="0B5E33"/>
-                <w:sz w:val="19"/>
-              </w:rPr>
-              <w:t>/portal</w:t>
-            </w:r>
-          </w:p>
-        </w:tc>
-      </w:tr>
-    </w:tbl>
-    <w:p>
-      <w:pPr>
-        <w:spacing w:after="40"/>
-      </w:pPr>
-    </w:p>
-    <w:p>
-      <w:r>
-        <w:br w:type="page"/>
-      </w:r>
-    </w:p>
-    <w:p>
-      <w:pPr>
-        <w:pStyle w:val="Heading1"/>
-      </w:pPr>
-      <w:r>
-        <w:rPr>
-          <w:b w:val="0"/>
-          <w:i w:val="0"/>
-          <w:color w:val="0B5E33"/>
-        </w:rPr>
-        <w:t>PowerWize — Hands-on Walkthrough</w:t>
-      </w:r>
-    </w:p>
-    <w:p>
-      <w:r>
-        <w:rPr>
-          <w:b w:val="0"/>
-          <w:i w:val="0"/>
-        </w:rPr>
-        <w:t xml:space="preserve">One continuous session where you follow a single person from </w:t>
-      </w:r>
-      <w:r>
-        <w:rPr>
-          <w:b w:val="0"/>
-          <w:i/>
-        </w:rPr>
-        <w:t>never heard of EnergyWize</w:t>
-      </w:r>
-      <w:r>
-        <w:rPr>
-          <w:b w:val="0"/>
-          <w:i w:val="0"/>
-        </w:rPr>
-        <w:t xml:space="preserve"> to </w:t>
-      </w:r>
-      <w:r>
-        <w:rPr>
-          <w:b w:val="0"/>
-          <w:i/>
-        </w:rPr>
-        <w:t>certified, with a solar quotation</w:t>
-      </w:r>
-      <w:r>
-        <w:rPr>
-          <w:b w:val="0"/>
-          <w:i w:val="0"/>
-        </w:rPr>
-        <w:t>. Every role and nearly every screen gets touched, in the order a real user would hit them, so each step sets up the next.</w:t>
-      </w:r>
-    </w:p>
-    <w:p>
-      <w:r>
-        <w:rPr>
-          <w:b/>
-          <w:i w:val="0"/>
-        </w:rPr>
-        <w:t>Time:</w:t>
-      </w:r>
-      <w:r>
-        <w:rPr>
-          <w:b w:val="0"/>
-          <w:i w:val="0"/>
-        </w:rPr>
-        <w:t xml:space="preserve"> ~90 minutes end to end. Each act stands alone if you want to skip around, except Acts 2–5, which are one chain.</w:t>
-      </w:r>
-    </w:p>
-    <w:p>
-      <w:pPr>
-        <w:pStyle w:val="Heading2"/>
-      </w:pPr>
-      <w:r>
-        <w:rPr>
-          <w:b w:val="0"/>
-          <w:i w:val="0"/>
-          <w:color w:val="0A1710"/>
-        </w:rPr>
-        <w:t>Prep — 5 minutes</w:t>
-      </w:r>
-    </w:p>
-    <w:p>
-      <w:pPr>
-        <w:pStyle w:val="Heading3"/>
-      </w:pPr>
-      <w:r>
-        <w:rPr>
-          <w:b w:val="0"/>
-          <w:i w:val="0"/>
-          <w:color w:val="0A1710"/>
-        </w:rPr>
-        <w:t>1. Fix the database connection</w:t>
-      </w:r>
-    </w:p>
-    <w:p>
-      <w:r>
-        <w:rPr>
-          <w:rFonts w:ascii="Consolas" w:hAnsi="Consolas"/>
-          <w:b w:val="0"/>
-          <w:i w:val="0"/>
-          <w:color w:val="0B5E33"/>
-          <w:sz w:val="19"/>
-        </w:rPr>
-        <w:t>.env</w:t>
-      </w:r>
-      <w:r>
-        <w:rPr>
-          <w:b w:val="0"/>
-          <w:i w:val="0"/>
-        </w:rPr>
-        <w:t xml:space="preserve"> points </w:t>
-      </w:r>
-      <w:r>
-        <w:rPr>
-          <w:rFonts w:ascii="Consolas" w:hAnsi="Consolas"/>
-          <w:b w:val="0"/>
-          <w:i w:val="0"/>
-          <w:color w:val="0B5E33"/>
-          <w:sz w:val="19"/>
-        </w:rPr>
-        <w:t>DATABASE_URL</w:t>
-      </w:r>
-      <w:r>
-        <w:rPr>
-          <w:b w:val="0"/>
-          <w:i w:val="0"/>
-        </w:rPr>
-        <w:t xml:space="preserve"> at a Postgres role named </w:t>
-      </w:r>
-      <w:r>
-        <w:rPr>
-          <w:rFonts w:ascii="Consolas" w:hAnsi="Consolas"/>
-          <w:b w:val="0"/>
-          <w:i w:val="0"/>
-          <w:color w:val="0B5E33"/>
-          <w:sz w:val="19"/>
-        </w:rPr>
-        <w:t>McZeal</w:t>
-      </w:r>
-      <w:r>
-        <w:rPr>
-          <w:b w:val="0"/>
-          <w:i w:val="0"/>
-        </w:rPr>
-        <w:t xml:space="preserve"> that doesn't exist in your Laragon cluster. Change the user to </w:t>
-      </w:r>
-      <w:r>
-        <w:rPr>
-          <w:rFonts w:ascii="Consolas" w:hAnsi="Consolas"/>
-          <w:b w:val="0"/>
-          <w:i w:val="0"/>
-          <w:color w:val="0B5E33"/>
-          <w:sz w:val="19"/>
-        </w:rPr>
-        <w:t>postgres</w:t>
-      </w:r>
-      <w:r>
-        <w:rPr>
-          <w:b w:val="0"/>
-          <w:i w:val="0"/>
-        </w:rPr>
-        <w:t>:</w:t>
-      </w:r>
-    </w:p>
-    <w:tbl>
-      <w:tblPr>
-        <w:tblStyle w:val="TableGrid"/>
-        <w:tblW w:type="auto" w:w="0"/>
-        <w:tblLook w:firstColumn="1" w:firstRow="1" w:lastColumn="0" w:lastRow="0" w:noHBand="0" w:noVBand="1" w:val="04A0"/>
-      </w:tblPr>
-      <w:tblGrid>
-        <w:gridCol w:w="9648"/>
-      </w:tblGrid>
-      <w:tr>
-        <w:tc>
-          <w:tcPr>
-            <w:tcW w:type="dxa" w:w="9648"/>
-            <w:shd w:val="clear" w:fill="F2F4F3"/>
-          </w:tcPr>
-          <w:p>
-            <w:pPr>
-              <w:spacing w:after="0" w:line="240" w:lineRule="auto"/>
-            </w:pPr>
-            <w:r/>
-            <w:r>
-              <w:rPr>
-                <w:rFonts w:ascii="Consolas" w:hAnsi="Consolas"/>
-                <w:sz w:val="18"/>
-              </w:rPr>
-              <w:t>DATABASE_URL=postgresql://postgres@localhost:5432/powerwize</w:t>
-            </w:r>
-          </w:p>
-        </w:tc>
-      </w:tr>
-    </w:tbl>
-    <w:p>
-      <w:pPr>
-        <w:spacing w:after="40"/>
-      </w:pPr>
-    </w:p>
-    <w:p>
-      <w:pPr>
-        <w:pStyle w:val="Heading3"/>
-      </w:pPr>
-      <w:r>
-        <w:rPr>
-          <w:b w:val="0"/>
-          <w:i w:val="0"/>
-          <w:color w:val="0A1710"/>
-        </w:rPr>
-        <w:t>2. Start Postgres</w:t>
-      </w:r>
-    </w:p>
-    <w:tbl>
-      <w:tblPr>
-        <w:tblStyle w:val="TableGrid"/>
-        <w:tblW w:type="auto" w:w="0"/>
-        <w:tblLook w:firstColumn="1" w:firstRow="1" w:lastColumn="0" w:lastRow="0" w:noHBand="0" w:noVBand="1" w:val="04A0"/>
-      </w:tblPr>
-      <w:tblGrid>
-        <w:gridCol w:w="9648"/>
-      </w:tblGrid>
-      <w:tr>
-        <w:tc>
-          <w:tcPr>
-            <w:tcW w:type="dxa" w:w="9648"/>
-            <w:shd w:val="clear" w:fill="F2F4F3"/>
-          </w:tcPr>
-          <w:p>
-            <w:pPr>
-              <w:spacing w:after="0" w:line="240" w:lineRule="auto"/>
-            </w:pPr>
-            <w:r/>
-            <w:r>
-              <w:rPr>
-                <w:rFonts w:ascii="Consolas" w:hAnsi="Consolas"/>
-                <w:sz w:val="18"/>
-              </w:rPr>
-              <w:t>"C:\laragon\bin\postgresql\postgresql-18.4-1-windows-x64\bin\pg_ctl.exe" \</w:t>
-            </w:r>
-          </w:p>
-          <w:p>
-            <w:pPr>
-              <w:spacing w:after="0" w:line="240" w:lineRule="auto"/>
-            </w:pPr>
-            <w:r>
-              <w:rPr>
-                <w:rFonts w:ascii="Consolas" w:hAnsi="Consolas"/>
-                <w:sz w:val="18"/>
-              </w:rPr>
-              <w:t xml:space="preserve">  -D "C:\laragon\data\postgresql" start</w:t>
-            </w:r>
-          </w:p>
-        </w:tc>
-      </w:tr>
-    </w:tbl>
-    <w:p>
-      <w:pPr>
-        <w:spacing w:after="40"/>
-      </w:pPr>
-    </w:p>
-    <w:p>
-      <w:pPr>
-        <w:pStyle w:val="Heading3"/>
-      </w:pPr>
-      <w:r>
-        <w:rPr>
-          <w:b w:val="0"/>
-          <w:i w:val="0"/>
-          <w:color w:val="0A1710"/>
-        </w:rPr>
-        <w:t>3. Decide about AI</w:t>
-      </w:r>
-    </w:p>
-    <w:p>
-      <w:r>
-        <w:rPr>
-          <w:rFonts w:ascii="Consolas" w:hAnsi="Consolas"/>
-          <w:b w:val="0"/>
-          <w:i w:val="0"/>
-          <w:color w:val="0B5E33"/>
-          <w:sz w:val="19"/>
-        </w:rPr>
-        <w:t>.env</w:t>
-      </w:r>
-      <w:r>
-        <w:rPr>
-          <w:b w:val="0"/>
-          <w:i w:val="0"/>
-        </w:rPr>
-        <w:t xml:space="preserve"> currently routes all AI at LM Studio on </w:t>
-      </w:r>
-      <w:r>
-        <w:rPr>
-          <w:rFonts w:ascii="Consolas" w:hAnsi="Consolas"/>
-          <w:b w:val="0"/>
-          <w:i w:val="0"/>
-          <w:color w:val="0B5E33"/>
-          <w:sz w:val="19"/>
-        </w:rPr>
-        <w:t>localhost:1234</w:t>
-      </w:r>
-      <w:r>
-        <w:rPr>
-          <w:b w:val="0"/>
-          <w:i w:val="0"/>
-        </w:rPr>
-        <w:t xml:space="preserve">. Either start LM Studio with </w:t>
-      </w:r>
-      <w:r>
-        <w:rPr>
-          <w:rFonts w:ascii="Consolas" w:hAnsi="Consolas"/>
-          <w:b w:val="0"/>
-          <w:i w:val="0"/>
-          <w:color w:val="0B5E33"/>
-          <w:sz w:val="19"/>
-        </w:rPr>
-        <w:t>qwen/qwen3-vl-8b</w:t>
-      </w:r>
-      <w:r>
-        <w:rPr>
-          <w:b w:val="0"/>
-          <w:i w:val="0"/>
-        </w:rPr>
-        <w:t xml:space="preserve">, </w:t>
-      </w:r>
-      <w:r>
-        <w:rPr>
-          <w:b/>
-          <w:i w:val="0"/>
-        </w:rPr>
-        <w:t>or</w:t>
-      </w:r>
-      <w:r>
-        <w:rPr>
-          <w:b w:val="0"/>
-          <w:i w:val="0"/>
-        </w:rPr>
-        <w:t xml:space="preserve"> switch to Groq (your key is already set):</w:t>
-      </w:r>
-    </w:p>
-    <w:tbl>
-      <w:tblPr>
-        <w:tblStyle w:val="TableGrid"/>
-        <w:tblW w:type="auto" w:w="0"/>
-        <w:tblLook w:firstColumn="1" w:firstRow="1" w:lastColumn="0" w:lastRow="0" w:noHBand="0" w:noVBand="1" w:val="04A0"/>
-      </w:tblPr>
-      <w:tblGrid>
-        <w:gridCol w:w="9648"/>
-      </w:tblGrid>
-      <w:tr>
-        <w:tc>
-          <w:tcPr>
-            <w:tcW w:type="dxa" w:w="9648"/>
-            <w:shd w:val="clear" w:fill="F2F4F3"/>
-          </w:tcPr>
-          <w:p>
-            <w:pPr>
-              <w:spacing w:after="0" w:line="240" w:lineRule="auto"/>
-            </w:pPr>
-            <w:r/>
-            <w:r>
-              <w:rPr>
-                <w:rFonts w:ascii="Consolas" w:hAnsi="Consolas"/>
-                <w:sz w:val="18"/>
-              </w:rPr>
-              <w:t>AI_PROVIDER=groq</w:t>
-            </w:r>
-          </w:p>
-          <w:p>
-            <w:pPr>
-              <w:spacing w:after="0" w:line="240" w:lineRule="auto"/>
-            </w:pPr>
-            <w:r>
-              <w:rPr>
-                <w:rFonts w:ascii="Consolas" w:hAnsi="Consolas"/>
-                <w:sz w:val="18"/>
-              </w:rPr>
-              <w:t>TEXT_PROVIDER=groq</w:t>
-            </w:r>
-          </w:p>
-          <w:p>
-            <w:pPr>
-              <w:spacing w:after="0" w:line="240" w:lineRule="auto"/>
-            </w:pPr>
-            <w:r>
-              <w:rPr>
-                <w:rFonts w:ascii="Consolas" w:hAnsi="Consolas"/>
-                <w:sz w:val="18"/>
-              </w:rPr>
-              <w:t>VISION_PROVIDER=groq</w:t>
-            </w:r>
-          </w:p>
-        </w:tc>
-      </w:tr>
-    </w:tbl>
-    <w:p>
-      <w:pPr>
-        <w:spacing w:after="40"/>
-      </w:pPr>
-    </w:p>
-    <w:p>
-      <w:r>
-        <w:rPr>
-          <w:b w:val="0"/>
-          <w:i w:val="0"/>
-        </w:rPr>
-        <w:t>Affects: upload validation, face match, quiz generation, quiz hints, module chat, bill OCR, Solara. Everything else works without it.</w:t>
-      </w:r>
-    </w:p>
-    <w:p>
-      <w:pPr>
-        <w:pStyle w:val="Heading3"/>
-      </w:pPr>
-      <w:r>
-        <w:rPr>
-          <w:b w:val="0"/>
-          <w:i w:val="0"/>
-          <w:color w:val="0A1710"/>
-        </w:rPr>
-        <w:t>4. Test accounts — already set up</w:t>
-      </w:r>
-    </w:p>
-    <w:p>
-      <w:r>
-        <w:rPr>
-          <w:b w:val="0"/>
-          <w:i w:val="0"/>
-        </w:rPr>
-        <w:t xml:space="preserve">These are live and verified: each one logs in through the real form and reaches its dashboard. </w:t>
-      </w:r>
-      <w:r>
-        <w:rPr>
-          <w:b/>
-          <w:i w:val="0"/>
-        </w:rPr>
-        <w:t xml:space="preserve">Password is </w:t>
-      </w:r>
-      <w:r>
-        <w:rPr>
-          <w:rFonts w:ascii="Consolas" w:hAnsi="Consolas"/>
-          <w:b/>
-          <w:i w:val="0"/>
-          <w:color w:val="0B5E33"/>
-          <w:sz w:val="19"/>
-        </w:rPr>
-        <w:t>Test@1234</w:t>
-      </w:r>
-      <w:r>
-        <w:rPr>
-          <w:b/>
-          <w:i w:val="0"/>
-        </w:rPr>
-        <w:t xml:space="preserve"> for all four.</w:t>
-      </w:r>
-    </w:p>
-    <w:tbl>
-      <w:tblPr>
-        <w:tblStyle w:val="TableGrid"/>
-        <w:tblW w:type="auto" w:w="0"/>
-        <w:jc w:val="center"/>
-        <w:tblLook w:firstColumn="1" w:firstRow="1" w:lastColumn="0" w:lastRow="0" w:noHBand="0" w:noVBand="1" w:val="04A0"/>
-      </w:tblPr>
-      <w:tblGrid>
-        <w:gridCol w:w="1930"/>
-        <w:gridCol w:w="1930"/>
-        <w:gridCol w:w="1930"/>
-        <w:gridCol w:w="1930"/>
-        <w:gridCol w:w="1930"/>
-      </w:tblGrid>
-      <w:tr>
-        <w:tc>
-          <w:tcPr>
-            <w:tcW w:type="dxa" w:w="1930"/>
-            <w:shd w:val="clear" w:fill="0B5E33"/>
-          </w:tcPr>
-          <w:p>
-            <w:r>
-              <w:rPr>
-                <w:b/>
-                <w:color w:val="FFFFFF"/>
-                <w:sz w:val="19"/>
-              </w:rPr>
-            </w:r>
-            <w:r>
-              <w:rPr>
-                <w:b/>
-                <w:i w:val="0"/>
-                <w:color w:val="FFFFFF"/>
-                <w:sz w:val="19"/>
-              </w:rPr>
-              <w:t>Role</w:t>
-            </w:r>
-          </w:p>
-        </w:tc>
-        <w:tc>
-          <w:tcPr>
-            <w:tcW w:type="dxa" w:w="1930"/>
-            <w:shd w:val="clear" w:fill="0B5E33"/>
-          </w:tcPr>
-          <w:p>
-            <w:r>
-              <w:rPr>
-                <w:b/>
-                <w:color w:val="FFFFFF"/>
-                <w:sz w:val="19"/>
-              </w:rPr>
-            </w:r>
-            <w:r>
-              <w:rPr>
-                <w:b/>
-                <w:i w:val="0"/>
-                <w:color w:val="FFFFFF"/>
-                <w:sz w:val="19"/>
-              </w:rPr>
-              <w:t>Email</w:t>
-            </w:r>
-          </w:p>
-        </w:tc>
-        <w:tc>
-          <w:tcPr>
-            <w:tcW w:type="dxa" w:w="1930"/>
-            <w:shd w:val="clear" w:fill="0B5E33"/>
-          </w:tcPr>
-          <w:p>
-            <w:r>
-              <w:rPr>
-                <w:b/>
-                <w:color w:val="FFFFFF"/>
-                <w:sz w:val="19"/>
-              </w:rPr>
-            </w:r>
-            <w:r>
-              <w:rPr>
-                <w:b/>
-                <w:i w:val="0"/>
-                <w:color w:val="FFFFFF"/>
-                <w:sz w:val="19"/>
-              </w:rPr>
-              <w:t>Password</w:t>
-            </w:r>
-          </w:p>
-        </w:tc>
-        <w:tc>
-          <w:tcPr>
-            <w:tcW w:type="dxa" w:w="1930"/>
-            <w:shd w:val="clear" w:fill="0B5E33"/>
-          </w:tcPr>
-          <w:p>
-            <w:r>
-              <w:rPr>
-                <w:b/>
-                <w:color w:val="FFFFFF"/>
-                <w:sz w:val="19"/>
-              </w:rPr>
-            </w:r>
-            <w:r>
-              <w:rPr>
-                <w:b/>
-                <w:i w:val="0"/>
-                <w:color w:val="FFFFFF"/>
-                <w:sz w:val="19"/>
-              </w:rPr>
-              <w:t>Lands on</w:t>
-            </w:r>
-          </w:p>
-        </w:tc>
-        <w:tc>
-          <w:tcPr>
-            <w:tcW w:type="dxa" w:w="1930"/>
-            <w:shd w:val="clear" w:fill="0B5E33"/>
-          </w:tcPr>
-          <w:p>
-            <w:r>
-              <w:rPr>
-                <w:b/>
-                <w:color w:val="FFFFFF"/>
-                <w:sz w:val="19"/>
-              </w:rPr>
-            </w:r>
-            <w:r>
-              <w:rPr>
-                <w:b/>
-                <w:i w:val="0"/>
-                <w:color w:val="FFFFFF"/>
-                <w:sz w:val="19"/>
-              </w:rPr>
-              <w:t>Why this one</w:t>
-            </w:r>
-          </w:p>
-        </w:tc>
-      </w:tr>
-      <w:tr>
-        <w:tc>
-          <w:tcPr>
-            <w:tcW w:type="dxa" w:w="1930"/>
-          </w:tcPr>
-          <w:p>
-            <w:r>
-              <w:rPr>
-                <w:sz w:val="19"/>
-              </w:rPr>
-            </w:r>
-            <w:r>
-              <w:rPr>
-                <w:b/>
-                <w:i w:val="0"/>
-                <w:sz w:val="19"/>
-              </w:rPr>
-              <w:t>Admin</w:t>
-            </w:r>
-          </w:p>
-        </w:tc>
-        <w:tc>
-          <w:tcPr>
-            <w:tcW w:type="dxa" w:w="1930"/>
-          </w:tcPr>
-          <w:p>
-            <w:r>
-              <w:rPr>
-                <w:sz w:val="19"/>
-              </w:rPr>
-            </w:r>
-            <w:r>
-              <w:rPr>
-                <w:rFonts w:ascii="Consolas" w:hAnsi="Consolas"/>
-                <w:b w:val="0"/>
-                <w:i w:val="0"/>
-                <w:color w:val="0B5E33"/>
-                <w:sz w:val="19"/>
-              </w:rPr>
-              <w:t>admin@ewize.com</w:t>
-            </w:r>
-          </w:p>
-        </w:tc>
-        <w:tc>
-          <w:tcPr>
-            <w:tcW w:type="dxa" w:w="1930"/>
-          </w:tcPr>
-          <w:p>
-            <w:r>
-              <w:rPr>
-                <w:sz w:val="19"/>
-              </w:rPr>
-            </w:r>
-            <w:r>
-              <w:rPr>
-                <w:rFonts w:ascii="Consolas" w:hAnsi="Consolas"/>
-                <w:b w:val="0"/>
-                <w:i w:val="0"/>
-                <w:color w:val="0B5E33"/>
-                <w:sz w:val="19"/>
-              </w:rPr>
-              <w:t>Test@1234</w:t>
-            </w:r>
-          </w:p>
-        </w:tc>
-        <w:tc>
-          <w:tcPr>
-            <w:tcW w:type="dxa" w:w="1930"/>
-          </w:tcPr>
-          <w:p>
-            <w:r>
-              <w:rPr>
-                <w:sz w:val="19"/>
-              </w:rPr>
-            </w:r>
-            <w:r>
-              <w:rPr>
-                <w:rFonts w:ascii="Consolas" w:hAnsi="Consolas"/>
-                <w:b w:val="0"/>
-                <w:i w:val="0"/>
-                <w:color w:val="0B5E33"/>
-                <w:sz w:val="19"/>
-              </w:rPr>
-              <w:t>/admin</w:t>
-            </w:r>
-          </w:p>
-        </w:tc>
-        <w:tc>
-          <w:tcPr>
-            <w:tcW w:type="dxa" w:w="1930"/>
-          </w:tcPr>
-          <w:p>
-            <w:r>
-              <w:rPr>
-                <w:sz w:val="19"/>
-              </w:rPr>
-            </w:r>
-            <w:r>
-              <w:rPr>
-                <w:b w:val="0"/>
-                <w:i w:val="0"/>
-                <w:sz w:val="19"/>
-              </w:rPr>
-              <w:t>Full oversight</w:t>
-            </w:r>
-          </w:p>
-        </w:tc>
-      </w:tr>
-      <w:tr>
-        <w:tc>
-          <w:tcPr>
-            <w:tcW w:type="dxa" w:w="1930"/>
-          </w:tcPr>
-          <w:p>
-            <w:r>
-              <w:rPr>
-                <w:sz w:val="19"/>
-              </w:rPr>
-            </w:r>
-            <w:r>
-              <w:rPr>
-                <w:b/>
-                <w:i w:val="0"/>
-                <w:sz w:val="19"/>
-              </w:rPr>
-              <w:t>Trainer</w:t>
-            </w:r>
-          </w:p>
-        </w:tc>
-        <w:tc>
-          <w:tcPr>
-            <w:tcW w:type="dxa" w:w="1930"/>
-          </w:tcPr>
-          <w:p>
-            <w:r>
-              <w:rPr>
-                <w:sz w:val="19"/>
-              </w:rPr>
-            </w:r>
-            <w:r>
-              <w:rPr>
-                <w:rFonts w:ascii="Consolas" w:hAnsi="Consolas"/>
-                <w:b w:val="0"/>
-                <w:i w:val="0"/>
-                <w:color w:val="0B5E33"/>
-                <w:sz w:val="19"/>
-              </w:rPr>
-              <w:t>patricia.v@ewize.com</w:t>
-            </w:r>
-          </w:p>
-        </w:tc>
-        <w:tc>
-          <w:tcPr>
-            <w:tcW w:type="dxa" w:w="1930"/>
-          </w:tcPr>
-          <w:p>
-            <w:r>
-              <w:rPr>
-                <w:sz w:val="19"/>
-              </w:rPr>
-            </w:r>
-            <w:r>
-              <w:rPr>
-                <w:rFonts w:ascii="Consolas" w:hAnsi="Consolas"/>
-                <w:b w:val="0"/>
-                <w:i w:val="0"/>
-                <w:color w:val="0B5E33"/>
-                <w:sz w:val="19"/>
-              </w:rPr>
-              <w:t>Test@1234</w:t>
-            </w:r>
-          </w:p>
-        </w:tc>
-        <w:tc>
-          <w:tcPr>
-            <w:tcW w:type="dxa" w:w="1930"/>
-          </w:tcPr>
-          <w:p>
-            <w:r>
-              <w:rPr>
-                <w:sz w:val="19"/>
-              </w:rPr>
-            </w:r>
-            <w:r>
-              <w:rPr>
-                <w:rFonts w:ascii="Consolas" w:hAnsi="Consolas"/>
-                <w:b w:val="0"/>
-                <w:i w:val="0"/>
-                <w:color w:val="0B5E33"/>
-                <w:sz w:val="19"/>
-              </w:rPr>
-              <w:t>/employee</w:t>
-            </w:r>
-          </w:p>
-        </w:tc>
-        <w:tc>
-          <w:tcPr>
-            <w:tcW w:type="dxa" w:w="1930"/>
-          </w:tcPr>
-          <w:p>
-            <w:r>
-              <w:rPr>
-                <w:sz w:val="19"/>
-              </w:rPr>
-            </w:r>
-            <w:r>
-              <w:rPr>
-                <w:b w:val="0"/>
-                <w:i w:val="0"/>
-                <w:sz w:val="19"/>
-              </w:rPr>
-              <w:t>Owns modules and submissions</w:t>
-            </w:r>
-          </w:p>
-        </w:tc>
-      </w:tr>
-      <w:tr>
-        <w:tc>
-          <w:tcPr>
-            <w:tcW w:type="dxa" w:w="1930"/>
-          </w:tcPr>
-          <w:p>
-            <w:r>
-              <w:rPr>
-                <w:sz w:val="19"/>
-              </w:rPr>
-            </w:r>
-            <w:r>
-              <w:rPr>
-                <w:b/>
-                <w:i w:val="0"/>
-                <w:sz w:val="19"/>
-              </w:rPr>
-              <w:t>Trainee</w:t>
-            </w:r>
-          </w:p>
-        </w:tc>
-        <w:tc>
-          <w:tcPr>
-            <w:tcW w:type="dxa" w:w="1930"/>
-          </w:tcPr>
-          <w:p>
-            <w:r>
-              <w:rPr>
-                <w:sz w:val="19"/>
-              </w:rPr>
-            </w:r>
-            <w:r>
-              <w:rPr>
-                <w:rFonts w:ascii="Consolas" w:hAnsi="Consolas"/>
-                <w:b w:val="0"/>
-                <w:i w:val="0"/>
-                <w:color w:val="0B5E33"/>
-                <w:sz w:val="19"/>
-              </w:rPr>
-              <w:t>miguel.torres@gmail.com</w:t>
-            </w:r>
-          </w:p>
-        </w:tc>
-        <w:tc>
-          <w:tcPr>
-            <w:tcW w:type="dxa" w:w="1930"/>
-          </w:tcPr>
-          <w:p>
-            <w:r>
-              <w:rPr>
-                <w:sz w:val="19"/>
-              </w:rPr>
-            </w:r>
-            <w:r>
-              <w:rPr>
-                <w:rFonts w:ascii="Consolas" w:hAnsi="Consolas"/>
-                <w:b w:val="0"/>
-                <w:i w:val="0"/>
-                <w:color w:val="0B5E33"/>
-                <w:sz w:val="19"/>
-              </w:rPr>
-              <w:t>Test@1234</w:t>
-            </w:r>
-          </w:p>
-        </w:tc>
-        <w:tc>
-          <w:tcPr>
-            <w:tcW w:type="dxa" w:w="1930"/>
-          </w:tcPr>
-          <w:p>
-            <w:r>
-              <w:rPr>
-                <w:sz w:val="19"/>
-              </w:rPr>
-            </w:r>
-            <w:r>
-              <w:rPr>
-                <w:rFonts w:ascii="Consolas" w:hAnsi="Consolas"/>
-                <w:b w:val="0"/>
-                <w:i w:val="0"/>
-                <w:color w:val="0B5E33"/>
-                <w:sz w:val="19"/>
-              </w:rPr>
-              <w:t>/portal</w:t>
-            </w:r>
-          </w:p>
-        </w:tc>
-        <w:tc>
-          <w:tcPr>
-            <w:tcW w:type="dxa" w:w="1930"/>
-          </w:tcPr>
-          <w:p>
-            <w:r>
-              <w:rPr>
-                <w:sz w:val="19"/>
-              </w:rPr>
-            </w:r>
-            <w:r>
-              <w:rPr>
-                <w:b w:val="0"/>
-                <w:i w:val="0"/>
-                <w:sz w:val="19"/>
-              </w:rPr>
-              <w:t>Paid, 100% done, has a certificate — best case</w:t>
-            </w:r>
-          </w:p>
-        </w:tc>
-      </w:tr>
-      <w:tr>
-        <w:tc>
-          <w:tcPr>
-            <w:tcW w:type="dxa" w:w="1930"/>
-          </w:tcPr>
-          <w:p>
-            <w:r>
-              <w:rPr>
-                <w:sz w:val="19"/>
-              </w:rPr>
-            </w:r>
-            <w:r>
-              <w:rPr>
-                <w:b/>
-                <w:i w:val="0"/>
-                <w:sz w:val="19"/>
-              </w:rPr>
-              <w:t>Trainee</w:t>
-            </w:r>
-          </w:p>
-        </w:tc>
-        <w:tc>
-          <w:tcPr>
-            <w:tcW w:type="dxa" w:w="1930"/>
-          </w:tcPr>
-          <w:p>
-            <w:r>
-              <w:rPr>
-                <w:sz w:val="19"/>
-              </w:rPr>
-            </w:r>
-            <w:r>
-              <w:rPr>
-                <w:rFonts w:ascii="Consolas" w:hAnsi="Consolas"/>
-                <w:b w:val="0"/>
-                <w:i w:val="0"/>
-                <w:color w:val="0B5E33"/>
-                <w:sz w:val="19"/>
-              </w:rPr>
-              <w:t>yivoveh244@bitmah.com</w:t>
-            </w:r>
-          </w:p>
-        </w:tc>
-        <w:tc>
-          <w:tcPr>
-            <w:tcW w:type="dxa" w:w="1930"/>
-          </w:tcPr>
-          <w:p>
-            <w:r>
-              <w:rPr>
-                <w:sz w:val="19"/>
-              </w:rPr>
-            </w:r>
-            <w:r>
-              <w:rPr>
-                <w:rFonts w:ascii="Consolas" w:hAnsi="Consolas"/>
-                <w:b w:val="0"/>
-                <w:i w:val="0"/>
-                <w:color w:val="0B5E33"/>
-                <w:sz w:val="19"/>
-              </w:rPr>
-              <w:t>Test@1234</w:t>
-            </w:r>
-          </w:p>
-        </w:tc>
-        <w:tc>
-          <w:tcPr>
-            <w:tcW w:type="dxa" w:w="1930"/>
-          </w:tcPr>
-          <w:p>
-            <w:r>
-              <w:rPr>
-                <w:sz w:val="19"/>
-              </w:rPr>
-            </w:r>
-            <w:r>
-              <w:rPr>
-                <w:rFonts w:ascii="Consolas" w:hAnsi="Consolas"/>
-                <w:b w:val="0"/>
-                <w:i w:val="0"/>
-                <w:color w:val="0B5E33"/>
-                <w:sz w:val="19"/>
-              </w:rPr>
-              <w:t>/portal</w:t>
-            </w:r>
-          </w:p>
-        </w:tc>
-        <w:tc>
-          <w:tcPr>
-            <w:tcW w:type="dxa" w:w="1930"/>
           </w:tcPr>
           <w:p>
             <w:r>
@@ -1878,7 +1724,7 @@
                 <w:rFonts w:ascii="Consolas" w:hAnsi="Consolas"/>
                 <w:sz w:val="18"/>
               </w:rPr>
-              <w:t>cur.execute('UPDATE users SET password_hash=%s WHERE email=%s', (h('Test@1234'), 'EMAIL_HERE'))</w:t>
+              <w:t>cur.execute('UPDATE users SET password_hash=%s WHERE email=%s', (h('NEW_PASSWORD_HERE'), 'EMAIL_HERE'))</w:t>
             </w:r>
           </w:p>
           <w:p>
@@ -2805,27 +2651,27 @@
       </w:r>
       <w:r>
         <w:rPr>
-          <w:b/>
-          <w:i w:val="0"/>
-        </w:rPr>
-        <w:t xml:space="preserve"> / </w:t>
+          <w:b w:val="0"/>
+          <w:i w:val="0"/>
+        </w:rPr>
+        <w:t xml:space="preserve"> (password in </w:t>
       </w:r>
       <w:r>
         <w:rPr>
           <w:rFonts w:ascii="Consolas" w:hAnsi="Consolas"/>
-          <w:b/>
+          <w:b w:val="0"/>
           <w:i w:val="0"/>
           <w:color w:val="0B5E33"/>
           <w:sz w:val="19"/>
         </w:rPr>
-        <w:t>Test@1234</w:t>
-      </w:r>
-      <w:r>
-        <w:rPr>
-          <w:b w:val="0"/>
-          <w:i w:val="0"/>
-        </w:rPr>
-        <w:t xml:space="preserve">. You land on </w:t>
+        <w:t>demo_credentials.txt</w:t>
+      </w:r>
+      <w:r>
+        <w:rPr>
+          <w:b w:val="0"/>
+          <w:i w:val="0"/>
+        </w:rPr>
+        <w:t xml:space="preserve">). You land on </w:t>
       </w:r>
       <w:r>
         <w:rPr>
@@ -3751,27 +3597,27 @@
       </w:r>
       <w:r>
         <w:rPr>
-          <w:b/>
-          <w:i w:val="0"/>
-        </w:rPr>
-        <w:t xml:space="preserve"> / </w:t>
+          <w:b w:val="0"/>
+          <w:i w:val="0"/>
+        </w:rPr>
+        <w:t xml:space="preserve"> (password in </w:t>
       </w:r>
       <w:r>
         <w:rPr>
           <w:rFonts w:ascii="Consolas" w:hAnsi="Consolas"/>
-          <w:b/>
+          <w:b w:val="0"/>
           <w:i w:val="0"/>
           <w:color w:val="0B5E33"/>
           <w:sz w:val="19"/>
         </w:rPr>
-        <w:t>Test@1234</w:t>
-      </w:r>
-      <w:r>
-        <w:rPr>
-          <w:b w:val="0"/>
-          <w:i w:val="0"/>
-        </w:rPr>
-        <w:t>.</w:t>
+        <w:t>demo_credentials.txt</w:t>
+      </w:r>
+      <w:r>
+        <w:rPr>
+          <w:b w:val="0"/>
+          <w:i w:val="0"/>
+        </w:rPr>
+        <w:t>).</w:t>
       </w:r>
     </w:p>
     <w:p>
@@ -4299,27 +4145,27 @@
       </w:r>
       <w:r>
         <w:rPr>
-          <w:b/>
-          <w:i w:val="0"/>
-        </w:rPr>
-        <w:t xml:space="preserve"> / </w:t>
+          <w:b w:val="0"/>
+          <w:i w:val="0"/>
+        </w:rPr>
+        <w:t xml:space="preserve"> (password in </w:t>
       </w:r>
       <w:r>
         <w:rPr>
           <w:rFonts w:ascii="Consolas" w:hAnsi="Consolas"/>
-          <w:b/>
+          <w:b w:val="0"/>
           <w:i w:val="0"/>
           <w:color w:val="0B5E33"/>
           <w:sz w:val="19"/>
         </w:rPr>
-        <w:t>Test@1234</w:t>
-      </w:r>
-      <w:r>
-        <w:rPr>
-          <w:b w:val="0"/>
-          <w:i w:val="0"/>
-        </w:rPr>
-        <w:t xml:space="preserve">. You land on </w:t>
+        <w:t>demo_credentials.txt</w:t>
+      </w:r>
+      <w:r>
+        <w:rPr>
+          <w:b w:val="0"/>
+          <w:i w:val="0"/>
+        </w:rPr>
+        <w:t xml:space="preserve">). You land on </w:t>
       </w:r>
       <w:r>
         <w:rPr>

</xml_diff>